<commit_message>
Set A4 and page numbers in the DOCX style donor
reference.docx declared no page setup, so Word fell back to US Letter, and it
carried no footer, so rendered output had no page numbers. Added A4 (11906 x
16838 twips) with 1in margins, a centered PAGE field footer, and a blank
first-page footer.

Body size 12pt -> 11pt to match the Arial heading treatment already in this
donor. Shared with naira-market-analysis and naira-narrative-report; see that
project's README for the full donor contract.

Co-Authored-By: Claude Opus 5 <noreply@anthropic.com>
</commit_message>
<xml_diff>
--- a/reference.docx
+++ b/reference.docx
@@ -314,9 +314,13 @@
       </w:r>
     </w:p>
     <w:sectPr>
+      <w:footerReference w:type="default" r:id="rId900"/>
+      <w:footerReference w:type="first" r:id="rId901"/>
       <w:footnotePr>
         <w:numRestart w:val="eachSect"/>
       </w:footnotePr>
+      <w:pgSz w:w="11906" w:h="16838"/>
+      <w:pgMar w:top="1440" w:right="1440" w:bottom="1440" w:left="1440" w:header="708" w:footer="708" w:gutter="0"/>
     </w:sectPr>
   </w:body>
 </w:document>
@@ -324,6 +328,41 @@
 
 <file path=word/comments.xml><?xml version="1.0" encoding="utf-8"?>
 <w:comments xmlns:w="http://schemas.openxmlformats.org/wordprocessingml/2006/main" xmlns:m="http://schemas.openxmlformats.org/officeDocument/2006/math" xmlns:r="http://schemas.openxmlformats.org/officeDocument/2006/relationships" xmlns:o="urn:schemas-microsoft-com:office:office" xmlns:v="urn:schemas-microsoft-com:vml" xmlns:w10="urn:schemas-microsoft-com:office:word" xmlns:a="http://schemas.openxmlformats.org/drawingml/2006/main" xmlns:pic="http://schemas.openxmlformats.org/drawingml/2006/picture" xmlns:wp="http://schemas.openxmlformats.org/drawingml/2006/wordprocessingDrawing"/>
+</file>
+
+<file path=word/footer1.xml><?xml version="1.0" encoding="utf-8"?>
+<w:ftr xmlns:w="http://schemas.openxmlformats.org/wordprocessingml/2006/main">
+  <w:p>
+    <w:pPr>
+      <w:jc w:val="center"/>
+    </w:pPr>
+    <w:r>
+      <w:fldChar w:fldCharType="begin"/>
+    </w:r>
+    <w:r>
+      <w:instrText xml:space="preserve"> PAGE </w:instrText>
+    </w:r>
+    <w:r>
+      <w:fldChar w:fldCharType="separate"/>
+    </w:r>
+    <w:r>
+      <w:t>1</w:t>
+    </w:r>
+    <w:r>
+      <w:fldChar w:fldCharType="end"/>
+    </w:r>
+  </w:p>
+</w:ftr>
+</file>
+
+<file path=word/footer2.xml><?xml version="1.0" encoding="utf-8"?>
+<w:ftr xmlns:w="http://schemas.openxmlformats.org/wordprocessingml/2006/main">
+  <w:p>
+    <w:pPr>
+      <w:jc w:val="center"/>
+    </w:pPr>
+  </w:p>
+</w:ftr>
 </file>
 
 <file path=word/footnotes.xml><?xml version="1.0" encoding="utf-8"?>

</xml_diff>

<commit_message>
Black headings in the DOCX style donor
Heading 1-9, their linked character styles, and TOC Heading move from Word's
default theme accent blue to black, matching naira-market-analysis. Hyperlink
keeps its colour.

Co-Authored-By: Claude Opus 5 <noreply@anthropic.com>
</commit_message>
<xml_diff>
--- a/reference.docx
+++ b/reference.docx
@@ -714,7 +714,7 @@
     </w:pPr>
     <w:rPr>
       <w:rFonts w:ascii="Arial" w:hAnsi="Arial" w:eastAsia="Arial" w:cs="Arial"/>
-      <w:color w:val="0F4761" w:themeColor="accent1" w:themeShade="BF"/>
+      <w:color w:val="000000"/>
       <w:sz w:val="40"/>
       <w:szCs w:val="40"/>
     </w:rPr>
@@ -737,7 +737,7 @@
     </w:pPr>
     <w:rPr>
       <w:rFonts w:ascii="Arial" w:hAnsi="Arial" w:eastAsia="Arial" w:cs="Arial"/>
-      <w:color w:val="0F4761" w:themeColor="accent1" w:themeShade="BF"/>
+      <w:color w:val="000000"/>
       <w:sz w:val="32"/>
       <w:szCs w:val="32"/>
     </w:rPr>
@@ -760,7 +760,7 @@
     </w:pPr>
     <w:rPr>
       <w:rFonts w:ascii="Arial" w:hAnsi="Arial" w:eastAsia="Arial" w:cs="Arial"/>
-      <w:color w:val="0F4761" w:themeColor="accent1" w:themeShade="BF"/>
+      <w:color w:val="000000"/>
       <w:sz w:val="28"/>
       <w:szCs w:val="28"/>
     </w:rPr>
@@ -785,7 +785,7 @@
       <w:rFonts w:ascii="Arial" w:hAnsi="Arial" w:eastAsia="Arial" w:cs="Arial"/>
       <w:i/>
       <w:iCs/>
-      <w:color w:val="0F4761" w:themeColor="accent1" w:themeShade="BF"/>
+      <w:color w:val="000000"/>
     </w:rPr>
   </w:style>
   <w:style w:type="paragraph" w:styleId="Heading5">
@@ -806,7 +806,7 @@
     </w:pPr>
     <w:rPr>
       <w:rFonts w:ascii="Arial" w:hAnsi="Arial" w:eastAsia="Arial" w:cs="Arial"/>
-      <w:color w:val="0F4761" w:themeColor="accent1" w:themeShade="BF"/>
+      <w:color w:val="000000"/>
     </w:rPr>
   </w:style>
   <w:style w:type="paragraph" w:styleId="Heading6">
@@ -829,7 +829,7 @@
       <w:rFonts w:ascii="Arial" w:hAnsi="Arial" w:eastAsia="Arial" w:cs="Arial"/>
       <w:i/>
       <w:iCs/>
-      <w:color w:val="595959" w:themeColor="text1" w:themeTint="A6"/>
+      <w:color w:val="000000"/>
     </w:rPr>
   </w:style>
   <w:style w:type="paragraph" w:styleId="Heading7">
@@ -850,7 +850,7 @@
     </w:pPr>
     <w:rPr>
       <w:rFonts w:ascii="Arial" w:hAnsi="Arial" w:eastAsia="Arial" w:cs="Arial"/>
-      <w:color w:val="595959" w:themeColor="text1" w:themeTint="A6"/>
+      <w:color w:val="000000"/>
     </w:rPr>
   </w:style>
   <w:style w:type="paragraph" w:styleId="Heading8">
@@ -873,7 +873,7 @@
       <w:rFonts w:ascii="Arial" w:hAnsi="Arial" w:eastAsia="Arial" w:cs="Arial"/>
       <w:i/>
       <w:iCs/>
-      <w:color w:val="272727" w:themeColor="text1" w:themeTint="D8"/>
+      <w:color w:val="000000"/>
     </w:rPr>
   </w:style>
   <w:style w:type="paragraph" w:styleId="Heading9">
@@ -894,7 +894,7 @@
     </w:pPr>
     <w:rPr>
       <w:rFonts w:ascii="Arial" w:hAnsi="Arial" w:eastAsia="Arial" w:cs="Arial"/>
-      <w:color w:val="272727" w:themeColor="text1" w:themeTint="D8"/>
+      <w:color w:val="000000"/>
     </w:rPr>
   </w:style>
   <w:style w:type="character" w:customStyle="1" w:styleId="Heading1Char">
@@ -905,7 +905,7 @@
     <w:rsid w:val="00A10FD9"/>
     <w:rPr>
       <w:rFonts w:ascii="Arial" w:hAnsi="Arial" w:eastAsia="Arial" w:cs="Arial"/>
-      <w:color w:val="0F4761" w:themeColor="accent1" w:themeShade="BF"/>
+      <w:color w:val="000000"/>
       <w:sz w:val="40"/>
       <w:szCs w:val="40"/>
     </w:rPr>
@@ -919,7 +919,7 @@
     <w:rsid w:val="00A10FD9"/>
     <w:rPr>
       <w:rFonts w:ascii="Arial" w:hAnsi="Arial" w:eastAsia="Arial" w:cs="Arial"/>
-      <w:color w:val="0F4761" w:themeColor="accent1" w:themeShade="BF"/>
+      <w:color w:val="000000"/>
       <w:sz w:val="32"/>
       <w:szCs w:val="32"/>
     </w:rPr>
@@ -933,7 +933,7 @@
     <w:rsid w:val="00A10FD9"/>
     <w:rPr>
       <w:rFonts w:ascii="Arial" w:hAnsi="Arial" w:eastAsia="Arial" w:cs="Arial"/>
-      <w:color w:val="0F4761" w:themeColor="accent1" w:themeShade="BF"/>
+      <w:color w:val="000000"/>
       <w:sz w:val="28"/>
       <w:szCs w:val="28"/>
     </w:rPr>
@@ -949,7 +949,7 @@
       <w:rFonts w:ascii="Arial" w:hAnsi="Arial" w:eastAsia="Arial" w:cs="Arial"/>
       <w:i/>
       <w:iCs/>
-      <w:color w:val="0F4761" w:themeColor="accent1" w:themeShade="BF"/>
+      <w:color w:val="000000"/>
     </w:rPr>
   </w:style>
   <w:style w:type="character" w:customStyle="1" w:styleId="Heading5Char">
@@ -961,7 +961,7 @@
     <w:rsid w:val="00A10FD9"/>
     <w:rPr>
       <w:rFonts w:ascii="Arial" w:hAnsi="Arial" w:eastAsia="Arial" w:cs="Arial"/>
-      <w:color w:val="0F4761" w:themeColor="accent1" w:themeShade="BF"/>
+      <w:color w:val="000000"/>
     </w:rPr>
   </w:style>
   <w:style w:type="character" w:customStyle="1" w:styleId="Heading6Char">
@@ -975,7 +975,7 @@
       <w:rFonts w:ascii="Arial" w:hAnsi="Arial" w:eastAsia="Arial" w:cs="Arial"/>
       <w:i/>
       <w:iCs/>
-      <w:color w:val="595959" w:themeColor="text1" w:themeTint="A6"/>
+      <w:color w:val="000000"/>
     </w:rPr>
   </w:style>
   <w:style w:type="character" w:customStyle="1" w:styleId="Heading7Char">
@@ -987,7 +987,7 @@
     <w:rsid w:val="00A10FD9"/>
     <w:rPr>
       <w:rFonts w:ascii="Arial" w:hAnsi="Arial" w:eastAsia="Arial" w:cs="Arial"/>
-      <w:color w:val="595959" w:themeColor="text1" w:themeTint="A6"/>
+      <w:color w:val="000000"/>
     </w:rPr>
   </w:style>
   <w:style w:type="character" w:customStyle="1" w:styleId="Heading8Char">
@@ -1001,7 +1001,7 @@
       <w:rFonts w:ascii="Arial" w:hAnsi="Arial" w:eastAsia="Arial" w:cs="Arial"/>
       <w:i/>
       <w:iCs/>
-      <w:color w:val="272727" w:themeColor="text1" w:themeTint="D8"/>
+      <w:color w:val="000000"/>
     </w:rPr>
   </w:style>
   <w:style w:type="character" w:customStyle="1" w:styleId="Heading9Char">
@@ -1013,7 +1013,7 @@
     <w:rsid w:val="00A10FD9"/>
     <w:rPr>
       <w:rFonts w:ascii="Arial" w:hAnsi="Arial" w:eastAsia="Arial" w:cs="Arial"/>
-      <w:color w:val="272727" w:themeColor="text1" w:themeTint="D8"/>
+      <w:color w:val="000000"/>
     </w:rPr>
   </w:style>
   <w:style w:type="paragraph" w:styleId="BlockText">
@@ -1174,7 +1174,7 @@
       <w:rFonts w:ascii="Arial" w:hAnsi="Arial" w:eastAsia="Arial" w:cs="Arial"/>
       <w:b w:val="0"/>
       <w:bCs w:val="0"/>
-      <w:color w:val="365F91" w:themeColor="accent1" w:themeShade="BF"/>
+      <w:color w:val="000000"/>
     </w:rPr>
   </w:style>
 </w:styles>

</xml_diff>